<commit_message>
docs: add Olist NoSQL ERD diagrams and remove submission document
</commit_message>
<xml_diff>
--- a/Submission files/BGU NOSQL 2026b HW2_netanel_rahum.docx
+++ b/Submission files/BGU NOSQL 2026b HW2_netanel_rahum.docx
@@ -385,21 +385,7 @@
         <w:spacing w:after="120"/>
       </w:pPr>
       <w:r>
-        <w:rPr>
-          <w:rFonts w:ascii="Arial" w:hAnsi="Arial"/>
-          <w:b/>
-          <w:sz w:val="23"/>
-          <w:rtl/>
-        </w:rPr>
-        <w:t xml:space="preserve">1. אוסף Orders (אוסף הליבה): </w:t>
-      </w:r>
-      <w:r>
-        <w:rPr>
-          <w:rFonts w:ascii="Arial" w:hAnsi="Arial"/>
-          <w:sz w:val="23"/>
-          <w:rtl/>
-        </w:rPr>
-        <w:t>מזהה (_id): order_id. שדות: סטטוס ההזמנה, חותמות זמן של רכישה, אישור, מסירה משוערת ומסירה בפועל. אובייקטים מקוננים: לקוח (Customer), מערך פריטים (Items - מוצר, מוכר, מחיר, משלוח) ומערך תשלומים (Payments).</w:t>
+        <w:t>1. אוסף Orders (אוסף הליבה): מזהה (_id): order_id. שדות: סטטוס ההזמנה, חותמות זמן של רכישה, אישור, מסירה משוערת ומסירה בפועל. אובייקטים מקוננים: לקוח (Customer), מערך פריטים (Items - מוצר, מוכר, מחיר, משלוח) ומערך תשלומים (Payments) ומערך ביקורות (Reviews).</w:t>
       </w:r>
     </w:p>
     <w:p>

</xml_diff>